<commit_message>
Arı ve ağaç kapı süsü yeni ağaç ve arıyla yenilendi; 24 Kasım'da gül buketli pano üste alındı
Co-Authored-By: Claude Opus 5.5 <noreply@anthropic.com>
Claude-Session: https://claude.ai/code/session_013rJve14Cyk1wDaznnSyQms
</commit_message>
<xml_diff>
--- a/ari-agac-temasi.docx
+++ b/ari-agac-temasi.docx
@@ -303,7 +303,7 @@
       <w:r>
         <w:drawing>
           <wp:inline xmlns:a="http://schemas.openxmlformats.org/drawingml/2006/main" xmlns:pic="http://schemas.openxmlformats.org/drawingml/2006/picture">
-            <wp:extent cx="10674000" cy="7552129"/>
+            <wp:extent cx="7542000" cy="10659684"/>
             <wp:docPr id="7" name="Picture 7"/>
             <wp:cNvGraphicFramePr>
               <a:graphicFrameLocks noChangeAspect="1"/>
@@ -324,7 +324,7 @@
                   <pic:spPr>
                     <a:xfrm>
                       <a:off x="0" y="0"/>
-                      <a:ext cx="10674000" cy="7552129"/>
+                      <a:ext cx="7542000" cy="10659684"/>
                     </a:xfrm>
                     <a:prstGeom prst="rect"/>
                   </pic:spPr>
@@ -338,7 +338,7 @@
     <w:p>
       <w:pPr>
         <w:sectPr>
-          <w:pgSz w:w="16838" w:h="11906" w:orient="landscape"/>
+          <w:pgSz w:w="11906" w:h="16838"/>
           <w:pgMar w:top="0" w:right="0" w:bottom="0" w:left="0" w:header="0" w:footer="0" w:gutter="0"/>
           <w:cols w:space="720"/>
           <w:docGrid w:linePitch="360"/>
@@ -352,7 +352,7 @@
       <w:r>
         <w:drawing>
           <wp:inline xmlns:a="http://schemas.openxmlformats.org/drawingml/2006/main" xmlns:pic="http://schemas.openxmlformats.org/drawingml/2006/picture">
-            <wp:extent cx="10674000" cy="7552129"/>
+            <wp:extent cx="7542000" cy="10659684"/>
             <wp:docPr id="8" name="Picture 8"/>
             <wp:cNvGraphicFramePr>
               <a:graphicFrameLocks noChangeAspect="1"/>
@@ -373,7 +373,7 @@
                   <pic:spPr>
                     <a:xfrm>
                       <a:off x="0" y="0"/>
-                      <a:ext cx="10674000" cy="7552129"/>
+                      <a:ext cx="7542000" cy="10659684"/>
                     </a:xfrm>
                     <a:prstGeom prst="rect"/>
                   </pic:spPr>
@@ -387,7 +387,7 @@
     <w:p>
       <w:pPr>
         <w:sectPr>
-          <w:pgSz w:w="16838" w:h="11906" w:orient="landscape"/>
+          <w:pgSz w:w="11906" w:h="16838"/>
           <w:pgMar w:top="0" w:right="0" w:bottom="0" w:left="0" w:header="0" w:footer="0" w:gutter="0"/>
           <w:cols w:space="720"/>
           <w:docGrid w:linePitch="360"/>
@@ -401,7 +401,7 @@
       <w:r>
         <w:drawing>
           <wp:inline xmlns:a="http://schemas.openxmlformats.org/drawingml/2006/main" xmlns:pic="http://schemas.openxmlformats.org/drawingml/2006/picture">
-            <wp:extent cx="10674000" cy="7552129"/>
+            <wp:extent cx="7542000" cy="10659684"/>
             <wp:docPr id="9" name="Picture 9"/>
             <wp:cNvGraphicFramePr>
               <a:graphicFrameLocks noChangeAspect="1"/>
@@ -422,7 +422,7 @@
                   <pic:spPr>
                     <a:xfrm>
                       <a:off x="0" y="0"/>
-                      <a:ext cx="10674000" cy="7552129"/>
+                      <a:ext cx="7542000" cy="10659684"/>
                     </a:xfrm>
                     <a:prstGeom prst="rect"/>
                   </pic:spPr>
@@ -436,7 +436,7 @@
     <w:p>
       <w:pPr>
         <w:sectPr>
-          <w:pgSz w:w="16838" w:h="11906" w:orient="landscape"/>
+          <w:pgSz w:w="11906" w:h="16838"/>
           <w:pgMar w:top="0" w:right="0" w:bottom="0" w:left="0" w:header="0" w:footer="0" w:gutter="0"/>
           <w:cols w:space="720"/>
           <w:docGrid w:linePitch="360"/>
@@ -499,7 +499,7 @@
       <w:r>
         <w:drawing>
           <wp:inline xmlns:a="http://schemas.openxmlformats.org/drawingml/2006/main" xmlns:pic="http://schemas.openxmlformats.org/drawingml/2006/picture">
-            <wp:extent cx="10674000" cy="7552129"/>
+            <wp:extent cx="7542000" cy="10659684"/>
             <wp:docPr id="11" name="Picture 11"/>
             <wp:cNvGraphicFramePr>
               <a:graphicFrameLocks noChangeAspect="1"/>
@@ -513,6 +513,202 @@
                   </pic:nvPicPr>
                   <pic:blipFill>
                     <a:blip r:embed="rId19"/>
+                    <a:stretch>
+                      <a:fillRect/>
+                    </a:stretch>
+                  </pic:blipFill>
+                  <pic:spPr>
+                    <a:xfrm>
+                      <a:off x="0" y="0"/>
+                      <a:ext cx="7542000" cy="10659684"/>
+                    </a:xfrm>
+                    <a:prstGeom prst="rect"/>
+                  </pic:spPr>
+                </pic:pic>
+              </a:graphicData>
+            </a:graphic>
+          </wp:inline>
+        </w:drawing>
+      </w:r>
+    </w:p>
+    <w:p>
+      <w:pPr>
+        <w:sectPr>
+          <w:pgSz w:w="11906" w:h="16838"/>
+          <w:pgMar w:top="0" w:right="0" w:bottom="0" w:left="0" w:header="0" w:footer="0" w:gutter="0"/>
+          <w:cols w:space="720"/>
+          <w:docGrid w:linePitch="360"/>
+        </w:sectPr>
+      </w:pPr>
+    </w:p>
+    <w:p>
+      <w:pPr>
+        <w:spacing w:before="0" w:after="0"/>
+      </w:pPr>
+      <w:r>
+        <w:drawing>
+          <wp:inline xmlns:a="http://schemas.openxmlformats.org/drawingml/2006/main" xmlns:pic="http://schemas.openxmlformats.org/drawingml/2006/picture">
+            <wp:extent cx="7542000" cy="10659684"/>
+            <wp:docPr id="12" name="Picture 12"/>
+            <wp:cNvGraphicFramePr>
+              <a:graphicFrameLocks noChangeAspect="1"/>
+            </wp:cNvGraphicFramePr>
+            <a:graphic>
+              <a:graphicData uri="http://schemas.openxmlformats.org/drawingml/2006/picture">
+                <pic:pic>
+                  <pic:nvPicPr>
+                    <pic:cNvPr id="0" name="p-12.jpg"/>
+                    <pic:cNvPicPr/>
+                  </pic:nvPicPr>
+                  <pic:blipFill>
+                    <a:blip r:embed="rId20"/>
+                    <a:stretch>
+                      <a:fillRect/>
+                    </a:stretch>
+                  </pic:blipFill>
+                  <pic:spPr>
+                    <a:xfrm>
+                      <a:off x="0" y="0"/>
+                      <a:ext cx="7542000" cy="10659684"/>
+                    </a:xfrm>
+                    <a:prstGeom prst="rect"/>
+                  </pic:spPr>
+                </pic:pic>
+              </a:graphicData>
+            </a:graphic>
+          </wp:inline>
+        </w:drawing>
+      </w:r>
+    </w:p>
+    <w:p>
+      <w:pPr>
+        <w:sectPr>
+          <w:pgSz w:w="11906" w:h="16838"/>
+          <w:pgMar w:top="0" w:right="0" w:bottom="0" w:left="0" w:header="0" w:footer="0" w:gutter="0"/>
+          <w:cols w:space="720"/>
+          <w:docGrid w:linePitch="360"/>
+        </w:sectPr>
+      </w:pPr>
+    </w:p>
+    <w:p>
+      <w:pPr>
+        <w:spacing w:before="0" w:after="0"/>
+      </w:pPr>
+      <w:r>
+        <w:drawing>
+          <wp:inline xmlns:a="http://schemas.openxmlformats.org/drawingml/2006/main" xmlns:pic="http://schemas.openxmlformats.org/drawingml/2006/picture">
+            <wp:extent cx="7542000" cy="10659684"/>
+            <wp:docPr id="13" name="Picture 13"/>
+            <wp:cNvGraphicFramePr>
+              <a:graphicFrameLocks noChangeAspect="1"/>
+            </wp:cNvGraphicFramePr>
+            <a:graphic>
+              <a:graphicData uri="http://schemas.openxmlformats.org/drawingml/2006/picture">
+                <pic:pic>
+                  <pic:nvPicPr>
+                    <pic:cNvPr id="0" name="p-13.jpg"/>
+                    <pic:cNvPicPr/>
+                  </pic:nvPicPr>
+                  <pic:blipFill>
+                    <a:blip r:embed="rId21"/>
+                    <a:stretch>
+                      <a:fillRect/>
+                    </a:stretch>
+                  </pic:blipFill>
+                  <pic:spPr>
+                    <a:xfrm>
+                      <a:off x="0" y="0"/>
+                      <a:ext cx="7542000" cy="10659684"/>
+                    </a:xfrm>
+                    <a:prstGeom prst="rect"/>
+                  </pic:spPr>
+                </pic:pic>
+              </a:graphicData>
+            </a:graphic>
+          </wp:inline>
+        </w:drawing>
+      </w:r>
+    </w:p>
+    <w:p>
+      <w:pPr>
+        <w:sectPr>
+          <w:pgSz w:w="11906" w:h="16838"/>
+          <w:pgMar w:top="0" w:right="0" w:bottom="0" w:left="0" w:header="0" w:footer="0" w:gutter="0"/>
+          <w:cols w:space="720"/>
+          <w:docGrid w:linePitch="360"/>
+        </w:sectPr>
+      </w:pPr>
+    </w:p>
+    <w:p>
+      <w:pPr>
+        <w:spacing w:before="0" w:after="0"/>
+      </w:pPr>
+      <w:r>
+        <w:drawing>
+          <wp:inline xmlns:a="http://schemas.openxmlformats.org/drawingml/2006/main" xmlns:pic="http://schemas.openxmlformats.org/drawingml/2006/picture">
+            <wp:extent cx="7542000" cy="10659684"/>
+            <wp:docPr id="14" name="Picture 14"/>
+            <wp:cNvGraphicFramePr>
+              <a:graphicFrameLocks noChangeAspect="1"/>
+            </wp:cNvGraphicFramePr>
+            <a:graphic>
+              <a:graphicData uri="http://schemas.openxmlformats.org/drawingml/2006/picture">
+                <pic:pic>
+                  <pic:nvPicPr>
+                    <pic:cNvPr id="0" name="p-14.jpg"/>
+                    <pic:cNvPicPr/>
+                  </pic:nvPicPr>
+                  <pic:blipFill>
+                    <a:blip r:embed="rId22"/>
+                    <a:stretch>
+                      <a:fillRect/>
+                    </a:stretch>
+                  </pic:blipFill>
+                  <pic:spPr>
+                    <a:xfrm>
+                      <a:off x="0" y="0"/>
+                      <a:ext cx="7542000" cy="10659684"/>
+                    </a:xfrm>
+                    <a:prstGeom prst="rect"/>
+                  </pic:spPr>
+                </pic:pic>
+              </a:graphicData>
+            </a:graphic>
+          </wp:inline>
+        </w:drawing>
+      </w:r>
+    </w:p>
+    <w:p>
+      <w:pPr>
+        <w:sectPr>
+          <w:pgSz w:w="11906" w:h="16838"/>
+          <w:pgMar w:top="0" w:right="0" w:bottom="0" w:left="0" w:header="0" w:footer="0" w:gutter="0"/>
+          <w:cols w:space="720"/>
+          <w:docGrid w:linePitch="360"/>
+        </w:sectPr>
+      </w:pPr>
+    </w:p>
+    <w:p>
+      <w:pPr>
+        <w:spacing w:before="0" w:after="0"/>
+      </w:pPr>
+      <w:r>
+        <w:drawing>
+          <wp:inline xmlns:a="http://schemas.openxmlformats.org/drawingml/2006/main" xmlns:pic="http://schemas.openxmlformats.org/drawingml/2006/picture">
+            <wp:extent cx="10674000" cy="7552129"/>
+            <wp:docPr id="15" name="Picture 15"/>
+            <wp:cNvGraphicFramePr>
+              <a:graphicFrameLocks noChangeAspect="1"/>
+            </wp:cNvGraphicFramePr>
+            <a:graphic>
+              <a:graphicData uri="http://schemas.openxmlformats.org/drawingml/2006/picture">
+                <pic:pic>
+                  <pic:nvPicPr>
+                    <pic:cNvPr id="0" name="p-15.jpg"/>
+                    <pic:cNvPicPr/>
+                  </pic:nvPicPr>
+                  <pic:blipFill>
+                    <a:blip r:embed="rId23"/>
                     <a:stretch>
                       <a:fillRect/>
                     </a:stretch>
@@ -549,7 +745,7 @@
         <w:drawing>
           <wp:inline xmlns:a="http://schemas.openxmlformats.org/drawingml/2006/main" xmlns:pic="http://schemas.openxmlformats.org/drawingml/2006/picture">
             <wp:extent cx="10674000" cy="7552129"/>
-            <wp:docPr id="12" name="Picture 12"/>
+            <wp:docPr id="16" name="Picture 16"/>
             <wp:cNvGraphicFramePr>
               <a:graphicFrameLocks noChangeAspect="1"/>
             </wp:cNvGraphicFramePr>
@@ -557,60 +753,11 @@
               <a:graphicData uri="http://schemas.openxmlformats.org/drawingml/2006/picture">
                 <pic:pic>
                   <pic:nvPicPr>
-                    <pic:cNvPr id="0" name="p-12.jpg"/>
+                    <pic:cNvPr id="0" name="p-16.jpg"/>
                     <pic:cNvPicPr/>
                   </pic:nvPicPr>
                   <pic:blipFill>
-                    <a:blip r:embed="rId20"/>
-                    <a:stretch>
-                      <a:fillRect/>
-                    </a:stretch>
-                  </pic:blipFill>
-                  <pic:spPr>
-                    <a:xfrm>
-                      <a:off x="0" y="0"/>
-                      <a:ext cx="10674000" cy="7552129"/>
-                    </a:xfrm>
-                    <a:prstGeom prst="rect"/>
-                  </pic:spPr>
-                </pic:pic>
-              </a:graphicData>
-            </a:graphic>
-          </wp:inline>
-        </w:drawing>
-      </w:r>
-    </w:p>
-    <w:p>
-      <w:pPr>
-        <w:sectPr>
-          <w:pgSz w:w="16838" w:h="11906" w:orient="landscape"/>
-          <w:pgMar w:top="0" w:right="0" w:bottom="0" w:left="0" w:header="0" w:footer="0" w:gutter="0"/>
-          <w:cols w:space="720"/>
-          <w:docGrid w:linePitch="360"/>
-        </w:sectPr>
-      </w:pPr>
-    </w:p>
-    <w:p>
-      <w:pPr>
-        <w:spacing w:before="0" w:after="0"/>
-      </w:pPr>
-      <w:r>
-        <w:drawing>
-          <wp:inline xmlns:a="http://schemas.openxmlformats.org/drawingml/2006/main" xmlns:pic="http://schemas.openxmlformats.org/drawingml/2006/picture">
-            <wp:extent cx="10674000" cy="7552129"/>
-            <wp:docPr id="13" name="Picture 13"/>
-            <wp:cNvGraphicFramePr>
-              <a:graphicFrameLocks noChangeAspect="1"/>
-            </wp:cNvGraphicFramePr>
-            <a:graphic>
-              <a:graphicData uri="http://schemas.openxmlformats.org/drawingml/2006/picture">
-                <pic:pic>
-                  <pic:nvPicPr>
-                    <pic:cNvPr id="0" name="p-13.jpg"/>
-                    <pic:cNvPicPr/>
-                  </pic:nvPicPr>
-                  <pic:blipFill>
-                    <a:blip r:embed="rId21"/>
+                    <a:blip r:embed="rId24"/>
                     <a:stretch>
                       <a:fillRect/>
                     </a:stretch>

</xml_diff>